<commit_message>
FMH-23: Update final mini project report and html with Jira board and Jenkins pipeline screenshots
</commit_message>
<xml_diff>
--- a/docs/MINI_PROJECT_REPORT.docx
+++ b/docs/MINI_PROJECT_REPORT.docx
@@ -7381,15 +7381,16 @@
         <w:tblLook w:firstColumn="1" w:firstRow="1" w:lastColumn="0" w:lastRow="0" w:noHBand="0" w:noVBand="1" w:val="04A0"/>
       </w:tblPr>
       <w:tblGrid>
-        <w:gridCol w:w="2340"/>
-        <w:gridCol w:w="2340"/>
-        <w:gridCol w:w="2340"/>
-        <w:gridCol w:w="2340"/>
+        <w:gridCol w:w="1872"/>
+        <w:gridCol w:w="1872"/>
+        <w:gridCol w:w="1872"/>
+        <w:gridCol w:w="1872"/>
+        <w:gridCol w:w="1872"/>
       </w:tblGrid>
       <w:tr>
         <w:tc>
           <w:tcPr>
-            <w:tcW w:type="dxa" w:w="2592"/>
+            <w:tcW w:type="dxa" w:w="2160"/>
             <w:shd w:fill="E2E8F0"/>
             <w:tcMar>
               <w:top w:w="120" w:type="dxa"/>
@@ -7422,7 +7423,7 @@
         </w:tc>
         <w:tc>
           <w:tcPr>
-            <w:tcW w:type="dxa" w:w="3168"/>
+            <w:tcW w:type="dxa" w:w="1296"/>
             <w:shd w:fill="E2E8F0"/>
             <w:tcMar>
               <w:top w:w="120" w:type="dxa"/>
@@ -7449,13 +7450,13 @@
                 <w:color w:val="0F172A"/>
                 <w:sz w:val="20"/>
               </w:rPr>
-              <w:t>Stories</w:t>
-            </w:r>
-          </w:p>
-        </w:tc>
-        <w:tc>
-          <w:tcPr>
-            <w:tcW w:type="dxa" w:w="1008"/>
+              <w:t>Roll No</w:t>
+            </w:r>
+          </w:p>
+        </w:tc>
+        <w:tc>
+          <w:tcPr>
+            <w:tcW w:type="dxa" w:w="3312"/>
             <w:shd w:fill="E2E8F0"/>
             <w:tcMar>
               <w:top w:w="120" w:type="dxa"/>
@@ -7482,13 +7483,13 @@
                 <w:color w:val="0F172A"/>
                 <w:sz w:val="20"/>
               </w:rPr>
-              <w:t>Points</w:t>
-            </w:r>
-          </w:p>
-        </w:tc>
-        <w:tc>
-          <w:tcPr>
-            <w:tcW w:type="dxa" w:w="2592"/>
+              <w:t>Delivered Stories &amp; Features</w:t>
+            </w:r>
+          </w:p>
+        </w:tc>
+        <w:tc>
+          <w:tcPr>
+            <w:tcW w:type="dxa" w:w="864"/>
             <w:shd w:fill="E2E8F0"/>
             <w:tcMar>
               <w:top w:w="120" w:type="dxa"/>
@@ -7515,7 +7516,40 @@
                 <w:color w:val="0F172A"/>
                 <w:sz w:val="20"/>
               </w:rPr>
-              <w:t>Tasks / Bugs</w:t>
+              <w:t>Points</w:t>
+            </w:r>
+          </w:p>
+        </w:tc>
+        <w:tc>
+          <w:tcPr>
+            <w:tcW w:type="dxa" w:w="3168"/>
+            <w:shd w:fill="E2E8F0"/>
+            <w:tcMar>
+              <w:top w:w="120" w:type="dxa"/>
+              <w:bottom w:w="120" w:type="dxa"/>
+              <w:left w:w="150" w:type="dxa"/>
+              <w:right w:w="150" w:type="dxa"/>
+            </w:tcMar>
+            <w:tcBorders>
+              <w:top w:val="single" w:sz="4" w:space="0" w:color="94A3B8"/>
+              <w:left w:val="single" w:sz="4" w:space="0" w:color="CCCCCC"/>
+              <w:bottom w:val="single" w:sz="4" w:space="0" w:color="94A3B8"/>
+              <w:right w:val="single" w:sz="4" w:space="0" w:color="CCCCCC"/>
+            </w:tcBorders>
+          </w:tcPr>
+          <w:p>
+            <w:pPr>
+              <w:spacing w:before="0" w:after="0"/>
+              <w:jc w:val="left"/>
+            </w:pPr>
+            <w:r>
+              <w:rPr>
+                <w:rFonts w:ascii="Times New Roman" w:hAnsi="Times New Roman"/>
+                <w:b/>
+                <w:color w:val="0F172A"/>
+                <w:sz w:val="20"/>
+              </w:rPr>
+              <w:t>Infrastructure &amp; Testing Ownership</w:t>
             </w:r>
           </w:p>
         </w:tc>
@@ -7523,7 +7557,7 @@
       <w:tr>
         <w:tc>
           <w:tcPr>
-            <w:tcW w:type="dxa" w:w="2592"/>
+            <w:tcW w:type="dxa" w:w="2160"/>
             <w:shd w:fill="FFFFFF"/>
             <w:tcMar>
               <w:top w:w="80" w:type="dxa"/>
@@ -7550,6 +7584,102 @@
                 <w:sz w:val="19"/>
               </w:rPr>
               <w:t>Mayank Heda</w:t>
+            </w:r>
+          </w:p>
+        </w:tc>
+        <w:tc>
+          <w:tcPr>
+            <w:tcW w:type="dxa" w:w="1296"/>
+            <w:shd w:fill="FFFFFF"/>
+            <w:tcMar>
+              <w:top w:w="80" w:type="dxa"/>
+              <w:bottom w:w="80" w:type="dxa"/>
+              <w:left w:w="150" w:type="dxa"/>
+              <w:right w:w="150" w:type="dxa"/>
+            </w:tcMar>
+            <w:tcBorders>
+              <w:top w:val="single" w:sz="4" w:space="0" w:color="E2E8F0"/>
+              <w:left w:val="single" w:sz="4" w:space="0" w:color="E2E8F0"/>
+              <w:bottom w:val="single" w:sz="4" w:space="0" w:color="E2E8F0"/>
+              <w:right w:val="single" w:sz="4" w:space="0" w:color="E2E8F0"/>
+            </w:tcBorders>
+          </w:tcPr>
+          <w:p>
+            <w:pPr>
+              <w:spacing w:before="0" w:after="0"/>
+              <w:jc w:val="left"/>
+            </w:pPr>
+            <w:r>
+              <w:rPr>
+                <w:rFonts w:ascii="Times New Roman" w:hAnsi="Times New Roman"/>
+                <w:color w:val="1E293B"/>
+                <w:sz w:val="19"/>
+              </w:rPr>
+              <w:t>2410135</w:t>
+            </w:r>
+          </w:p>
+        </w:tc>
+        <w:tc>
+          <w:tcPr>
+            <w:tcW w:type="dxa" w:w="3312"/>
+            <w:shd w:fill="FFFFFF"/>
+            <w:tcMar>
+              <w:top w:w="80" w:type="dxa"/>
+              <w:bottom w:w="80" w:type="dxa"/>
+              <w:left w:w="150" w:type="dxa"/>
+              <w:right w:w="150" w:type="dxa"/>
+            </w:tcMar>
+            <w:tcBorders>
+              <w:top w:val="single" w:sz="4" w:space="0" w:color="E2E8F0"/>
+              <w:left w:val="single" w:sz="4" w:space="0" w:color="E2E8F0"/>
+              <w:bottom w:val="single" w:sz="4" w:space="0" w:color="E2E8F0"/>
+              <w:right w:val="single" w:sz="4" w:space="0" w:color="E2E8F0"/>
+            </w:tcBorders>
+          </w:tcPr>
+          <w:p>
+            <w:pPr>
+              <w:spacing w:before="0" w:after="0"/>
+              <w:jc w:val="left"/>
+            </w:pPr>
+            <w:r>
+              <w:rPr>
+                <w:rFonts w:ascii="Times New Roman" w:hAnsi="Times New Roman"/>
+                <w:color w:val="1E293B"/>
+                <w:sz w:val="19"/>
+              </w:rPr>
+              <w:t>FMH-1, FMH-7, FMH-17, FMH-21, FMH-22</w:t>
+            </w:r>
+          </w:p>
+        </w:tc>
+        <w:tc>
+          <w:tcPr>
+            <w:tcW w:type="dxa" w:w="864"/>
+            <w:shd w:fill="FFFFFF"/>
+            <w:tcMar>
+              <w:top w:w="80" w:type="dxa"/>
+              <w:bottom w:w="80" w:type="dxa"/>
+              <w:left w:w="150" w:type="dxa"/>
+              <w:right w:w="150" w:type="dxa"/>
+            </w:tcMar>
+            <w:tcBorders>
+              <w:top w:val="single" w:sz="4" w:space="0" w:color="E2E8F0"/>
+              <w:left w:val="single" w:sz="4" w:space="0" w:color="E2E8F0"/>
+              <w:bottom w:val="single" w:sz="4" w:space="0" w:color="E2E8F0"/>
+              <w:right w:val="single" w:sz="4" w:space="0" w:color="E2E8F0"/>
+            </w:tcBorders>
+          </w:tcPr>
+          <w:p>
+            <w:pPr>
+              <w:spacing w:before="0" w:after="0"/>
+              <w:jc w:val="left"/>
+            </w:pPr>
+            <w:r>
+              <w:rPr>
+                <w:rFonts w:ascii="Times New Roman" w:hAnsi="Times New Roman"/>
+                <w:color w:val="1E293B"/>
+                <w:sz w:val="19"/>
+              </w:rPr>
+              <w:t>19</w:t>
             </w:r>
           </w:p>
         </w:tc>
@@ -7581,71 +7711,7 @@
                 <w:color w:val="1E293B"/>
                 <w:sz w:val="19"/>
               </w:rPr>
-              <w:t>FMH-1, FMH-10</w:t>
-            </w:r>
-          </w:p>
-        </w:tc>
-        <w:tc>
-          <w:tcPr>
-            <w:tcW w:type="dxa" w:w="1008"/>
-            <w:shd w:fill="FFFFFF"/>
-            <w:tcMar>
-              <w:top w:w="80" w:type="dxa"/>
-              <w:bottom w:w="80" w:type="dxa"/>
-              <w:left w:w="150" w:type="dxa"/>
-              <w:right w:w="150" w:type="dxa"/>
-            </w:tcMar>
-            <w:tcBorders>
-              <w:top w:val="single" w:sz="4" w:space="0" w:color="E2E8F0"/>
-              <w:left w:val="single" w:sz="4" w:space="0" w:color="E2E8F0"/>
-              <w:bottom w:val="single" w:sz="4" w:space="0" w:color="E2E8F0"/>
-              <w:right w:val="single" w:sz="4" w:space="0" w:color="E2E8F0"/>
-            </w:tcBorders>
-          </w:tcPr>
-          <w:p>
-            <w:pPr>
-              <w:spacing w:before="0" w:after="0"/>
-              <w:jc w:val="left"/>
-            </w:pPr>
-            <w:r>
-              <w:rPr>
-                <w:rFonts w:ascii="Times New Roman" w:hAnsi="Times New Roman"/>
-                <w:color w:val="1E293B"/>
-                <w:sz w:val="19"/>
-              </w:rPr>
-              <w:t>10</w:t>
-            </w:r>
-          </w:p>
-        </w:tc>
-        <w:tc>
-          <w:tcPr>
-            <w:tcW w:type="dxa" w:w="2592"/>
-            <w:shd w:fill="FFFFFF"/>
-            <w:tcMar>
-              <w:top w:w="80" w:type="dxa"/>
-              <w:bottom w:w="80" w:type="dxa"/>
-              <w:left w:w="150" w:type="dxa"/>
-              <w:right w:w="150" w:type="dxa"/>
-            </w:tcMar>
-            <w:tcBorders>
-              <w:top w:val="single" w:sz="4" w:space="0" w:color="E2E8F0"/>
-              <w:left w:val="single" w:sz="4" w:space="0" w:color="E2E8F0"/>
-              <w:bottom w:val="single" w:sz="4" w:space="0" w:color="E2E8F0"/>
-              <w:right w:val="single" w:sz="4" w:space="0" w:color="E2E8F0"/>
-            </w:tcBorders>
-          </w:tcPr>
-          <w:p>
-            <w:pPr>
-              <w:spacing w:before="0" w:after="0"/>
-              <w:jc w:val="left"/>
-            </w:pPr>
-            <w:r>
-              <w:rPr>
-                <w:rFonts w:ascii="Times New Roman" w:hAnsi="Times New Roman"/>
-                <w:color w:val="1E293B"/>
-                <w:sz w:val="19"/>
-              </w:rPr>
-              <w:t>FMH-5, FMH-7, FMH-12, Bug FMH-15</w:t>
+              <w:t>FMH-3 (Git repo), FMH-5 (Docker Compose), FMH-6 (Jenkinsfile), viva guide</w:t>
             </w:r>
           </w:p>
         </w:tc>
@@ -7653,7 +7719,7 @@
       <w:tr>
         <w:tc>
           <w:tcPr>
-            <w:tcW w:type="dxa" w:w="2592"/>
+            <w:tcW w:type="dxa" w:w="2160"/>
             <w:shd w:fill="F8FAFC"/>
             <w:tcMar>
               <w:top w:w="80" w:type="dxa"/>
@@ -7680,6 +7746,102 @@
                 <w:sz w:val="19"/>
               </w:rPr>
               <w:t>Ishita Gurbaxani</w:t>
+            </w:r>
+          </w:p>
+        </w:tc>
+        <w:tc>
+          <w:tcPr>
+            <w:tcW w:type="dxa" w:w="1296"/>
+            <w:shd w:fill="F8FAFC"/>
+            <w:tcMar>
+              <w:top w:w="80" w:type="dxa"/>
+              <w:bottom w:w="80" w:type="dxa"/>
+              <w:left w:w="150" w:type="dxa"/>
+              <w:right w:w="150" w:type="dxa"/>
+            </w:tcMar>
+            <w:tcBorders>
+              <w:top w:val="single" w:sz="4" w:space="0" w:color="E2E8F0"/>
+              <w:left w:val="single" w:sz="4" w:space="0" w:color="E2E8F0"/>
+              <w:bottom w:val="single" w:sz="4" w:space="0" w:color="E2E8F0"/>
+              <w:right w:val="single" w:sz="4" w:space="0" w:color="E2E8F0"/>
+            </w:tcBorders>
+          </w:tcPr>
+          <w:p>
+            <w:pPr>
+              <w:spacing w:before="0" w:after="0"/>
+              <w:jc w:val="left"/>
+            </w:pPr>
+            <w:r>
+              <w:rPr>
+                <w:rFonts w:ascii="Times New Roman" w:hAnsi="Times New Roman"/>
+                <w:color w:val="1E293B"/>
+                <w:sz w:val="19"/>
+              </w:rPr>
+              <w:t>2401034</w:t>
+            </w:r>
+          </w:p>
+        </w:tc>
+        <w:tc>
+          <w:tcPr>
+            <w:tcW w:type="dxa" w:w="3312"/>
+            <w:shd w:fill="F8FAFC"/>
+            <w:tcMar>
+              <w:top w:w="80" w:type="dxa"/>
+              <w:bottom w:w="80" w:type="dxa"/>
+              <w:left w:w="150" w:type="dxa"/>
+              <w:right w:w="150" w:type="dxa"/>
+            </w:tcMar>
+            <w:tcBorders>
+              <w:top w:val="single" w:sz="4" w:space="0" w:color="E2E8F0"/>
+              <w:left w:val="single" w:sz="4" w:space="0" w:color="E2E8F0"/>
+              <w:bottom w:val="single" w:sz="4" w:space="0" w:color="E2E8F0"/>
+              <w:right w:val="single" w:sz="4" w:space="0" w:color="E2E8F0"/>
+            </w:tcBorders>
+          </w:tcPr>
+          <w:p>
+            <w:pPr>
+              <w:spacing w:before="0" w:after="0"/>
+              <w:jc w:val="left"/>
+            </w:pPr>
+            <w:r>
+              <w:rPr>
+                <w:rFonts w:ascii="Times New Roman" w:hAnsi="Times New Roman"/>
+                <w:color w:val="1E293B"/>
+                <w:sz w:val="19"/>
+              </w:rPr>
+              <w:t>FMH-9, FMH-11, FMH-12, FMH-20, FMH-24</w:t>
+            </w:r>
+          </w:p>
+        </w:tc>
+        <w:tc>
+          <w:tcPr>
+            <w:tcW w:type="dxa" w:w="864"/>
+            <w:shd w:fill="F8FAFC"/>
+            <w:tcMar>
+              <w:top w:w="80" w:type="dxa"/>
+              <w:bottom w:w="80" w:type="dxa"/>
+              <w:left w:w="150" w:type="dxa"/>
+              <w:right w:w="150" w:type="dxa"/>
+            </w:tcMar>
+            <w:tcBorders>
+              <w:top w:val="single" w:sz="4" w:space="0" w:color="E2E8F0"/>
+              <w:left w:val="single" w:sz="4" w:space="0" w:color="E2E8F0"/>
+              <w:bottom w:val="single" w:sz="4" w:space="0" w:color="E2E8F0"/>
+              <w:right w:val="single" w:sz="4" w:space="0" w:color="E2E8F0"/>
+            </w:tcBorders>
+          </w:tcPr>
+          <w:p>
+            <w:pPr>
+              <w:spacing w:before="0" w:after="0"/>
+              <w:jc w:val="left"/>
+            </w:pPr>
+            <w:r>
+              <w:rPr>
+                <w:rFonts w:ascii="Times New Roman" w:hAnsi="Times New Roman"/>
+                <w:color w:val="1E293B"/>
+                <w:sz w:val="19"/>
+              </w:rPr>
+              <w:t>19</w:t>
             </w:r>
           </w:p>
         </w:tc>
@@ -7711,71 +7873,7 @@
                 <w:color w:val="1E293B"/>
                 <w:sz w:val="19"/>
               </w:rPr>
-              <w:t>FMH-2, FMH-4, FMH-8, FMH-9, FMH-11</w:t>
-            </w:r>
-          </w:p>
-        </w:tc>
-        <w:tc>
-          <w:tcPr>
-            <w:tcW w:type="dxa" w:w="1008"/>
-            <w:shd w:fill="F8FAFC"/>
-            <w:tcMar>
-              <w:top w:w="80" w:type="dxa"/>
-              <w:bottom w:w="80" w:type="dxa"/>
-              <w:left w:w="150" w:type="dxa"/>
-              <w:right w:w="150" w:type="dxa"/>
-            </w:tcMar>
-            <w:tcBorders>
-              <w:top w:val="single" w:sz="4" w:space="0" w:color="E2E8F0"/>
-              <w:left w:val="single" w:sz="4" w:space="0" w:color="E2E8F0"/>
-              <w:bottom w:val="single" w:sz="4" w:space="0" w:color="E2E8F0"/>
-              <w:right w:val="single" w:sz="4" w:space="0" w:color="E2E8F0"/>
-            </w:tcBorders>
-          </w:tcPr>
-          <w:p>
-            <w:pPr>
-              <w:spacing w:before="0" w:after="0"/>
-              <w:jc w:val="left"/>
-            </w:pPr>
-            <w:r>
-              <w:rPr>
-                <w:rFonts w:ascii="Times New Roman" w:hAnsi="Times New Roman"/>
-                <w:color w:val="1E293B"/>
-                <w:sz w:val="19"/>
-              </w:rPr>
-              <w:t>19</w:t>
-            </w:r>
-          </w:p>
-        </w:tc>
-        <w:tc>
-          <w:tcPr>
-            <w:tcW w:type="dxa" w:w="2592"/>
-            <w:shd w:fill="F8FAFC"/>
-            <w:tcMar>
-              <w:top w:w="80" w:type="dxa"/>
-              <w:bottom w:w="80" w:type="dxa"/>
-              <w:left w:w="150" w:type="dxa"/>
-              <w:right w:w="150" w:type="dxa"/>
-            </w:tcMar>
-            <w:tcBorders>
-              <w:top w:val="single" w:sz="4" w:space="0" w:color="E2E8F0"/>
-              <w:left w:val="single" w:sz="4" w:space="0" w:color="E2E8F0"/>
-              <w:bottom w:val="single" w:sz="4" w:space="0" w:color="E2E8F0"/>
-              <w:right w:val="single" w:sz="4" w:space="0" w:color="E2E8F0"/>
-            </w:tcBorders>
-          </w:tcPr>
-          <w:p>
-            <w:pPr>
-              <w:spacing w:before="0" w:after="0"/>
-              <w:jc w:val="left"/>
-            </w:pPr>
-            <w:r>
-              <w:rPr>
-                <w:rFonts w:ascii="Times New Roman" w:hAnsi="Times New Roman"/>
-                <w:color w:val="1E293B"/>
-                <w:sz w:val="19"/>
-              </w:rPr>
-              <w:t>Frontend tests &amp; validation</w:t>
+              <w:t>FMH-13 (Vitest tests), FMH-14 (Chart.js dashboard), mobile UI polish</w:t>
             </w:r>
           </w:p>
         </w:tc>
@@ -7783,7 +7881,7 @@
       <w:tr>
         <w:tc>
           <w:tcPr>
-            <w:tcW w:type="dxa" w:w="2592"/>
+            <w:tcW w:type="dxa" w:w="2160"/>
             <w:shd w:fill="FFFFFF"/>
             <w:tcMar>
               <w:top w:w="80" w:type="dxa"/>
@@ -7810,6 +7908,102 @@
                 <w:sz w:val="19"/>
               </w:rPr>
               <w:t>Bhavisha Kewalramani</w:t>
+            </w:r>
+          </w:p>
+        </w:tc>
+        <w:tc>
+          <w:tcPr>
+            <w:tcW w:type="dxa" w:w="1296"/>
+            <w:shd w:fill="FFFFFF"/>
+            <w:tcMar>
+              <w:top w:w="80" w:type="dxa"/>
+              <w:bottom w:w="80" w:type="dxa"/>
+              <w:left w:w="150" w:type="dxa"/>
+              <w:right w:w="150" w:type="dxa"/>
+            </w:tcMar>
+            <w:tcBorders>
+              <w:top w:val="single" w:sz="4" w:space="0" w:color="E2E8F0"/>
+              <w:left w:val="single" w:sz="4" w:space="0" w:color="E2E8F0"/>
+              <w:bottom w:val="single" w:sz="4" w:space="0" w:color="E2E8F0"/>
+              <w:right w:val="single" w:sz="4" w:space="0" w:color="E2E8F0"/>
+            </w:tcBorders>
+          </w:tcPr>
+          <w:p>
+            <w:pPr>
+              <w:spacing w:before="0" w:after="0"/>
+              <w:jc w:val="left"/>
+            </w:pPr>
+            <w:r>
+              <w:rPr>
+                <w:rFonts w:ascii="Times New Roman" w:hAnsi="Times New Roman"/>
+                <w:color w:val="1E293B"/>
+                <w:sz w:val="19"/>
+              </w:rPr>
+              <w:t>2401044</w:t>
+            </w:r>
+          </w:p>
+        </w:tc>
+        <w:tc>
+          <w:tcPr>
+            <w:tcW w:type="dxa" w:w="3312"/>
+            <w:shd w:fill="FFFFFF"/>
+            <w:tcMar>
+              <w:top w:w="80" w:type="dxa"/>
+              <w:bottom w:w="80" w:type="dxa"/>
+              <w:left w:w="150" w:type="dxa"/>
+              <w:right w:w="150" w:type="dxa"/>
+            </w:tcMar>
+            <w:tcBorders>
+              <w:top w:val="single" w:sz="4" w:space="0" w:color="E2E8F0"/>
+              <w:left w:val="single" w:sz="4" w:space="0" w:color="E2E8F0"/>
+              <w:bottom w:val="single" w:sz="4" w:space="0" w:color="E2E8F0"/>
+              <w:right w:val="single" w:sz="4" w:space="0" w:color="E2E8F0"/>
+            </w:tcBorders>
+          </w:tcPr>
+          <w:p>
+            <w:pPr>
+              <w:spacing w:before="0" w:after="0"/>
+              <w:jc w:val="left"/>
+            </w:pPr>
+            <w:r>
+              <w:rPr>
+                <w:rFonts w:ascii="Times New Roman" w:hAnsi="Times New Roman"/>
+                <w:color w:val="1E293B"/>
+                <w:sz w:val="19"/>
+              </w:rPr>
+              <w:t>FMH-2, FMH-4, FMH-8, FMH-18, FMH-19</w:t>
+            </w:r>
+          </w:p>
+        </w:tc>
+        <w:tc>
+          <w:tcPr>
+            <w:tcW w:type="dxa" w:w="864"/>
+            <w:shd w:fill="FFFFFF"/>
+            <w:tcMar>
+              <w:top w:w="80" w:type="dxa"/>
+              <w:bottom w:w="80" w:type="dxa"/>
+              <w:left w:w="150" w:type="dxa"/>
+              <w:right w:w="150" w:type="dxa"/>
+            </w:tcMar>
+            <w:tcBorders>
+              <w:top w:val="single" w:sz="4" w:space="0" w:color="E2E8F0"/>
+              <w:left w:val="single" w:sz="4" w:space="0" w:color="E2E8F0"/>
+              <w:bottom w:val="single" w:sz="4" w:space="0" w:color="E2E8F0"/>
+              <w:right w:val="single" w:sz="4" w:space="0" w:color="E2E8F0"/>
+            </w:tcBorders>
+          </w:tcPr>
+          <w:p>
+            <w:pPr>
+              <w:spacing w:before="0" w:after="0"/>
+              <w:jc w:val="left"/>
+            </w:pPr>
+            <w:r>
+              <w:rPr>
+                <w:rFonts w:ascii="Times New Roman" w:hAnsi="Times New Roman"/>
+                <w:color w:val="1E293B"/>
+                <w:sz w:val="19"/>
+              </w:rPr>
+              <w:t>18</w:t>
             </w:r>
           </w:p>
         </w:tc>
@@ -7841,71 +8035,7 @@
                 <w:color w:val="1E293B"/>
                 <w:sz w:val="19"/>
               </w:rPr>
-              <w:t>Schema &amp; Cache Integration</w:t>
-            </w:r>
-          </w:p>
-        </w:tc>
-        <w:tc>
-          <w:tcPr>
-            <w:tcW w:type="dxa" w:w="1008"/>
-            <w:shd w:fill="FFFFFF"/>
-            <w:tcMar>
-              <w:top w:w="80" w:type="dxa"/>
-              <w:bottom w:w="80" w:type="dxa"/>
-              <w:left w:w="150" w:type="dxa"/>
-              <w:right w:w="150" w:type="dxa"/>
-            </w:tcMar>
-            <w:tcBorders>
-              <w:top w:val="single" w:sz="4" w:space="0" w:color="E2E8F0"/>
-              <w:left w:val="single" w:sz="4" w:space="0" w:color="E2E8F0"/>
-              <w:bottom w:val="single" w:sz="4" w:space="0" w:color="E2E8F0"/>
-              <w:right w:val="single" w:sz="4" w:space="0" w:color="E2E8F0"/>
-            </w:tcBorders>
-          </w:tcPr>
-          <w:p>
-            <w:pPr>
-              <w:spacing w:before="0" w:after="0"/>
-              <w:jc w:val="left"/>
-            </w:pPr>
-            <w:r>
-              <w:rPr>
-                <w:rFonts w:ascii="Times New Roman" w:hAnsi="Times New Roman"/>
-                <w:color w:val="1E293B"/>
-                <w:sz w:val="19"/>
-              </w:rPr>
-              <w:t>—</w:t>
-            </w:r>
-          </w:p>
-        </w:tc>
-        <w:tc>
-          <w:tcPr>
-            <w:tcW w:type="dxa" w:w="2592"/>
-            <w:shd w:fill="FFFFFF"/>
-            <w:tcMar>
-              <w:top w:w="80" w:type="dxa"/>
-              <w:bottom w:w="80" w:type="dxa"/>
-              <w:left w:w="150" w:type="dxa"/>
-              <w:right w:w="150" w:type="dxa"/>
-            </w:tcMar>
-            <w:tcBorders>
-              <w:top w:val="single" w:sz="4" w:space="0" w:color="E2E8F0"/>
-              <w:left w:val="single" w:sz="4" w:space="0" w:color="E2E8F0"/>
-              <w:bottom w:val="single" w:sz="4" w:space="0" w:color="E2E8F0"/>
-              <w:right w:val="single" w:sz="4" w:space="0" w:color="E2E8F0"/>
-            </w:tcBorders>
-          </w:tcPr>
-          <w:p>
-            <w:pPr>
-              <w:spacing w:before="0" w:after="0"/>
-              <w:jc w:val="left"/>
-            </w:pPr>
-            <w:r>
-              <w:rPr>
-                <w:rFonts w:ascii="Times New Roman" w:hAnsi="Times New Roman"/>
-                <w:color w:val="1E293B"/>
-                <w:sz w:val="19"/>
-              </w:rPr>
-              <w:t>FMH-3, FMH-6, FMH-13, FMH-14</w:t>
+              <w:t>FMH-10 (40 Jest tests), FMH-15 (Prometheus), FMH-16 (Grafana/Nagios), FMH-23</w:t>
             </w:r>
           </w:p>
         </w:tc>
@@ -7915,6 +8045,61 @@
       <w:pPr>
         <w:spacing w:before="0" w:after="120"/>
       </w:pPr>
+    </w:p>
+    <w:p>
+      <w:pPr>
+        <w:spacing w:before="160" w:after="40"/>
+        <w:jc w:val="center"/>
+      </w:pPr>
+      <w:r>
+        <w:drawing>
+          <wp:inline xmlns:a="http://schemas.openxmlformats.org/drawingml/2006/main" xmlns:pic="http://schemas.openxmlformats.org/drawingml/2006/picture">
+            <wp:extent cx="5486400" cy="3104812"/>
+            <wp:docPr id="1" name="Picture 1"/>
+            <wp:cNvGraphicFramePr>
+              <a:graphicFrameLocks noChangeAspect="1"/>
+            </wp:cNvGraphicFramePr>
+            <a:graphic>
+              <a:graphicData uri="http://schemas.openxmlformats.org/drawingml/2006/picture">
+                <pic:pic>
+                  <pic:nvPicPr>
+                    <pic:cNvPr id="0" name="14_jira_board.png"/>
+                    <pic:cNvPicPr/>
+                  </pic:nvPicPr>
+                  <pic:blipFill>
+                    <a:blip r:embed="rId9"/>
+                    <a:stretch>
+                      <a:fillRect/>
+                    </a:stretch>
+                  </pic:blipFill>
+                  <pic:spPr>
+                    <a:xfrm>
+                      <a:off x="0" y="0"/>
+                      <a:ext cx="5486400" cy="3104812"/>
+                    </a:xfrm>
+                    <a:prstGeom prst="rect"/>
+                  </pic:spPr>
+                </pic:pic>
+              </a:graphicData>
+            </a:graphic>
+          </wp:inline>
+        </w:drawing>
+      </w:r>
+    </w:p>
+    <w:p>
+      <w:pPr>
+        <w:spacing w:before="40" w:after="160"/>
+        <w:jc w:val="center"/>
+      </w:pPr>
+      <w:r>
+        <w:rPr>
+          <w:rFonts w:ascii="Times New Roman" w:hAnsi="Times New Roman"/>
+          <w:i/>
+          <w:color w:val="334155"/>
+          <w:sz w:val="20"/>
+        </w:rPr>
+        <w:t>Figure 2.1: Live Jira Scrum board with Sprint 3 active, story points, and task distribution across Mayank Heda, Ishita Gurbaxani, and Bhavisha Kewalramani</w:t>
+      </w:r>
     </w:p>
     <w:p>
       <w:pPr>
@@ -8082,7 +8267,7 @@
         <w:drawing>
           <wp:inline xmlns:a="http://schemas.openxmlformats.org/drawingml/2006/main" xmlns:pic="http://schemas.openxmlformats.org/drawingml/2006/picture">
             <wp:extent cx="5486400" cy="3546764"/>
-            <wp:docPr id="1" name="Picture 1"/>
+            <wp:docPr id="2" name="Picture 2"/>
             <wp:cNvGraphicFramePr>
               <a:graphicFrameLocks noChangeAspect="1"/>
             </wp:cNvGraphicFramePr>
@@ -8094,7 +8279,7 @@
                     <pic:cNvPicPr/>
                   </pic:nvPicPr>
                   <pic:blipFill>
-                    <a:blip r:embed="rId9"/>
+                    <a:blip r:embed="rId10"/>
                     <a:stretch>
                       <a:fillRect/>
                     </a:stretch>
@@ -9183,7 +9368,7 @@
         <w:drawing>
           <wp:inline xmlns:a="http://schemas.openxmlformats.org/drawingml/2006/main" xmlns:pic="http://schemas.openxmlformats.org/drawingml/2006/picture">
             <wp:extent cx="5486400" cy="3156989"/>
-            <wp:docPr id="2" name="Picture 2"/>
+            <wp:docPr id="3" name="Picture 3"/>
             <wp:cNvGraphicFramePr>
               <a:graphicFrameLocks noChangeAspect="1"/>
             </wp:cNvGraphicFramePr>
@@ -9195,7 +9380,7 @@
                     <pic:cNvPicPr/>
                   </pic:nvPicPr>
                   <pic:blipFill>
-                    <a:blip r:embed="rId10"/>
+                    <a:blip r:embed="rId11"/>
                     <a:stretch>
                       <a:fillRect/>
                     </a:stretch>
@@ -9267,7 +9452,7 @@
         <w:drawing>
           <wp:inline xmlns:a="http://schemas.openxmlformats.org/drawingml/2006/main" xmlns:pic="http://schemas.openxmlformats.org/drawingml/2006/picture">
             <wp:extent cx="5486400" cy="1972174"/>
-            <wp:docPr id="3" name="Picture 3"/>
+            <wp:docPr id="4" name="Picture 4"/>
             <wp:cNvGraphicFramePr>
               <a:graphicFrameLocks noChangeAspect="1"/>
             </wp:cNvGraphicFramePr>
@@ -9279,7 +9464,7 @@
                     <pic:cNvPicPr/>
                   </pic:nvPicPr>
                   <pic:blipFill>
-                    <a:blip r:embed="rId11"/>
+                    <a:blip r:embed="rId12"/>
                     <a:stretch>
                       <a:fillRect/>
                     </a:stretch>
@@ -11572,7 +11757,7 @@
         <w:drawing>
           <wp:inline xmlns:a="http://schemas.openxmlformats.org/drawingml/2006/main" xmlns:pic="http://schemas.openxmlformats.org/drawingml/2006/picture">
             <wp:extent cx="5120640" cy="3471062"/>
-            <wp:docPr id="4" name="Picture 4"/>
+            <wp:docPr id="5" name="Picture 5"/>
             <wp:cNvGraphicFramePr>
               <a:graphicFrameLocks noChangeAspect="1"/>
             </wp:cNvGraphicFramePr>
@@ -11584,7 +11769,7 @@
                     <pic:cNvPicPr/>
                   </pic:nvPicPr>
                   <pic:blipFill>
-                    <a:blip r:embed="rId12"/>
+                    <a:blip r:embed="rId13"/>
                     <a:stretch>
                       <a:fillRect/>
                     </a:stretch>
@@ -11627,7 +11812,7 @@
         <w:drawing>
           <wp:inline xmlns:a="http://schemas.openxmlformats.org/drawingml/2006/main" xmlns:pic="http://schemas.openxmlformats.org/drawingml/2006/picture">
             <wp:extent cx="5120640" cy="3471062"/>
-            <wp:docPr id="5" name="Picture 5"/>
+            <wp:docPr id="6" name="Picture 6"/>
             <wp:cNvGraphicFramePr>
               <a:graphicFrameLocks noChangeAspect="1"/>
             </wp:cNvGraphicFramePr>
@@ -11639,7 +11824,7 @@
                     <pic:cNvPicPr/>
                   </pic:nvPicPr>
                   <pic:blipFill>
-                    <a:blip r:embed="rId13"/>
+                    <a:blip r:embed="rId14"/>
                     <a:stretch>
                       <a:fillRect/>
                     </a:stretch>
@@ -11682,7 +11867,7 @@
         <w:drawing>
           <wp:inline xmlns:a="http://schemas.openxmlformats.org/drawingml/2006/main" xmlns:pic="http://schemas.openxmlformats.org/drawingml/2006/picture">
             <wp:extent cx="5120640" cy="4337914"/>
-            <wp:docPr id="6" name="Picture 6"/>
+            <wp:docPr id="7" name="Picture 7"/>
             <wp:cNvGraphicFramePr>
               <a:graphicFrameLocks noChangeAspect="1"/>
             </wp:cNvGraphicFramePr>
@@ -11694,7 +11879,7 @@
                     <pic:cNvPicPr/>
                   </pic:nvPicPr>
                   <pic:blipFill>
-                    <a:blip r:embed="rId14"/>
+                    <a:blip r:embed="rId15"/>
                     <a:stretch>
                       <a:fillRect/>
                     </a:stretch>
@@ -11737,7 +11922,7 @@
         <w:drawing>
           <wp:inline xmlns:a="http://schemas.openxmlformats.org/drawingml/2006/main" xmlns:pic="http://schemas.openxmlformats.org/drawingml/2006/picture">
             <wp:extent cx="5120640" cy="4443984"/>
-            <wp:docPr id="7" name="Picture 7"/>
+            <wp:docPr id="8" name="Picture 8"/>
             <wp:cNvGraphicFramePr>
               <a:graphicFrameLocks noChangeAspect="1"/>
             </wp:cNvGraphicFramePr>
@@ -11749,7 +11934,7 @@
                     <pic:cNvPicPr/>
                   </pic:nvPicPr>
                   <pic:blipFill>
-                    <a:blip r:embed="rId15"/>
+                    <a:blip r:embed="rId16"/>
                     <a:stretch>
                       <a:fillRect/>
                     </a:stretch>
@@ -11792,7 +11977,7 @@
         <w:drawing>
           <wp:inline xmlns:a="http://schemas.openxmlformats.org/drawingml/2006/main" xmlns:pic="http://schemas.openxmlformats.org/drawingml/2006/picture">
             <wp:extent cx="5120640" cy="4564685"/>
-            <wp:docPr id="8" name="Picture 8"/>
+            <wp:docPr id="9" name="Picture 9"/>
             <wp:cNvGraphicFramePr>
               <a:graphicFrameLocks noChangeAspect="1"/>
             </wp:cNvGraphicFramePr>
@@ -11804,7 +11989,7 @@
                     <pic:cNvPicPr/>
                   </pic:nvPicPr>
                   <pic:blipFill>
-                    <a:blip r:embed="rId16"/>
+                    <a:blip r:embed="rId17"/>
                     <a:stretch>
                       <a:fillRect/>
                     </a:stretch>
@@ -11876,7 +12061,7 @@
         <w:drawing>
           <wp:inline xmlns:a="http://schemas.openxmlformats.org/drawingml/2006/main" xmlns:pic="http://schemas.openxmlformats.org/drawingml/2006/picture">
             <wp:extent cx="5120640" cy="18002707"/>
-            <wp:docPr id="9" name="Picture 9"/>
+            <wp:docPr id="10" name="Picture 10"/>
             <wp:cNvGraphicFramePr>
               <a:graphicFrameLocks noChangeAspect="1"/>
             </wp:cNvGraphicFramePr>
@@ -11888,7 +12073,7 @@
                     <pic:cNvPicPr/>
                   </pic:nvPicPr>
                   <pic:blipFill>
-                    <a:blip r:embed="rId17"/>
+                    <a:blip r:embed="rId18"/>
                     <a:stretch>
                       <a:fillRect/>
                     </a:stretch>
@@ -11960,7 +12145,7 @@
         <w:drawing>
           <wp:inline xmlns:a="http://schemas.openxmlformats.org/drawingml/2006/main" xmlns:pic="http://schemas.openxmlformats.org/drawingml/2006/picture">
             <wp:extent cx="5120640" cy="6093562"/>
-            <wp:docPr id="10" name="Picture 10"/>
+            <wp:docPr id="11" name="Picture 11"/>
             <wp:cNvGraphicFramePr>
               <a:graphicFrameLocks noChangeAspect="1"/>
             </wp:cNvGraphicFramePr>
@@ -11972,7 +12157,7 @@
                     <pic:cNvPicPr/>
                   </pic:nvPicPr>
                   <pic:blipFill>
-                    <a:blip r:embed="rId18"/>
+                    <a:blip r:embed="rId19"/>
                     <a:stretch>
                       <a:fillRect/>
                     </a:stretch>
@@ -12107,7 +12292,7 @@
         <w:drawing>
           <wp:inline xmlns:a="http://schemas.openxmlformats.org/drawingml/2006/main" xmlns:pic="http://schemas.openxmlformats.org/drawingml/2006/picture">
             <wp:extent cx="5486400" cy="2057400"/>
-            <wp:docPr id="11" name="Picture 11"/>
+            <wp:docPr id="12" name="Picture 12"/>
             <wp:cNvGraphicFramePr>
               <a:graphicFrameLocks noChangeAspect="1"/>
             </wp:cNvGraphicFramePr>
@@ -12119,7 +12304,7 @@
                     <pic:cNvPicPr/>
                   </pic:nvPicPr>
                   <pic:blipFill>
-                    <a:blip r:embed="rId19"/>
+                    <a:blip r:embed="rId20"/>
                     <a:stretch>
                       <a:fillRect/>
                     </a:stretch>
@@ -15903,6 +16088,61 @@
     </w:p>
     <w:p>
       <w:pPr>
+        <w:spacing w:before="160" w:after="40"/>
+        <w:jc w:val="center"/>
+      </w:pPr>
+      <w:r>
+        <w:drawing>
+          <wp:inline xmlns:a="http://schemas.openxmlformats.org/drawingml/2006/main" xmlns:pic="http://schemas.openxmlformats.org/drawingml/2006/picture">
+            <wp:extent cx="5486400" cy="3330627"/>
+            <wp:docPr id="13" name="Picture 13"/>
+            <wp:cNvGraphicFramePr>
+              <a:graphicFrameLocks noChangeAspect="1"/>
+            </wp:cNvGraphicFramePr>
+            <a:graphic>
+              <a:graphicData uri="http://schemas.openxmlformats.org/drawingml/2006/picture">
+                <pic:pic>
+                  <pic:nvPicPr>
+                    <pic:cNvPr id="0" name="13_jenkins_pipeline.png"/>
+                    <pic:cNvPicPr/>
+                  </pic:nvPicPr>
+                  <pic:blipFill>
+                    <a:blip r:embed="rId21"/>
+                    <a:stretch>
+                      <a:fillRect/>
+                    </a:stretch>
+                  </pic:blipFill>
+                  <pic:spPr>
+                    <a:xfrm>
+                      <a:off x="0" y="0"/>
+                      <a:ext cx="5486400" cy="3330627"/>
+                    </a:xfrm>
+                    <a:prstGeom prst="rect"/>
+                  </pic:spPr>
+                </pic:pic>
+              </a:graphicData>
+            </a:graphic>
+          </wp:inline>
+        </w:drawing>
+      </w:r>
+    </w:p>
+    <w:p>
+      <w:pPr>
+        <w:spacing w:before="40" w:after="160"/>
+        <w:jc w:val="center"/>
+      </w:pPr>
+      <w:r>
+        <w:rPr>
+          <w:rFonts w:ascii="Times New Roman" w:hAnsi="Times New Roman"/>
+          <w:i/>
+          <w:color w:val="334155"/>
+          <w:sz w:val="20"/>
+        </w:rPr>
+        <w:t>Figure 5.7: Jenkins multibranch automated CI/CD pipeline stage view (Build #2 SUCCESS across all 6 stages)</w:t>
+      </w:r>
+    </w:p>
+    <w:p>
+      <w:pPr>
         <w:keepNext/>
         <w:spacing w:before="200" w:after="80"/>
         <w:jc w:val="left"/>
@@ -17613,7 +17853,7 @@
         <w:drawing>
           <wp:inline xmlns:a="http://schemas.openxmlformats.org/drawingml/2006/main" xmlns:pic="http://schemas.openxmlformats.org/drawingml/2006/picture">
             <wp:extent cx="5120640" cy="3291840"/>
-            <wp:docPr id="12" name="Picture 12"/>
+            <wp:docPr id="14" name="Picture 14"/>
             <wp:cNvGraphicFramePr>
               <a:graphicFrameLocks noChangeAspect="1"/>
             </wp:cNvGraphicFramePr>
@@ -17625,7 +17865,7 @@
                     <pic:cNvPicPr/>
                   </pic:nvPicPr>
                   <pic:blipFill>
-                    <a:blip r:embed="rId20"/>
+                    <a:blip r:embed="rId22"/>
                     <a:stretch>
                       <a:fillRect/>
                     </a:stretch>
@@ -17668,7 +17908,7 @@
         <w:drawing>
           <wp:inline xmlns:a="http://schemas.openxmlformats.org/drawingml/2006/main" xmlns:pic="http://schemas.openxmlformats.org/drawingml/2006/picture">
             <wp:extent cx="5120640" cy="3291840"/>
-            <wp:docPr id="13" name="Picture 13"/>
+            <wp:docPr id="15" name="Picture 15"/>
             <wp:cNvGraphicFramePr>
               <a:graphicFrameLocks noChangeAspect="1"/>
             </wp:cNvGraphicFramePr>
@@ -17680,7 +17920,7 @@
                     <pic:cNvPicPr/>
                   </pic:nvPicPr>
                   <pic:blipFill>
-                    <a:blip r:embed="rId21"/>
+                    <a:blip r:embed="rId23"/>
                     <a:stretch>
                       <a:fillRect/>
                     </a:stretch>
@@ -17723,7 +17963,7 @@
         <w:drawing>
           <wp:inline xmlns:a="http://schemas.openxmlformats.org/drawingml/2006/main" xmlns:pic="http://schemas.openxmlformats.org/drawingml/2006/picture">
             <wp:extent cx="5303520" cy="5528008"/>
-            <wp:docPr id="14" name="Picture 14"/>
+            <wp:docPr id="16" name="Picture 16"/>
             <wp:cNvGraphicFramePr>
               <a:graphicFrameLocks noChangeAspect="1"/>
             </wp:cNvGraphicFramePr>
@@ -17735,7 +17975,7 @@
                     <pic:cNvPicPr/>
                   </pic:nvPicPr>
                   <pic:blipFill>
-                    <a:blip r:embed="rId22"/>
+                    <a:blip r:embed="rId24"/>
                     <a:stretch>
                       <a:fillRect/>
                     </a:stretch>
@@ -17778,7 +18018,7 @@
         <w:drawing>
           <wp:inline xmlns:a="http://schemas.openxmlformats.org/drawingml/2006/main" xmlns:pic="http://schemas.openxmlformats.org/drawingml/2006/picture">
             <wp:extent cx="5120640" cy="3291840"/>
-            <wp:docPr id="15" name="Picture 15"/>
+            <wp:docPr id="17" name="Picture 17"/>
             <wp:cNvGraphicFramePr>
               <a:graphicFrameLocks noChangeAspect="1"/>
             </wp:cNvGraphicFramePr>
@@ -17790,7 +18030,7 @@
                     <pic:cNvPicPr/>
                   </pic:nvPicPr>
                   <pic:blipFill>
-                    <a:blip r:embed="rId23"/>
+                    <a:blip r:embed="rId25"/>
                     <a:stretch>
                       <a:fillRect/>
                     </a:stretch>
@@ -17833,7 +18073,7 @@
         <w:drawing>
           <wp:inline xmlns:a="http://schemas.openxmlformats.org/drawingml/2006/main" xmlns:pic="http://schemas.openxmlformats.org/drawingml/2006/picture">
             <wp:extent cx="5120640" cy="3291840"/>
-            <wp:docPr id="16" name="Picture 16"/>
+            <wp:docPr id="18" name="Picture 18"/>
             <wp:cNvGraphicFramePr>
               <a:graphicFrameLocks noChangeAspect="1"/>
             </wp:cNvGraphicFramePr>
@@ -17845,7 +18085,7 @@
                     <pic:cNvPicPr/>
                   </pic:nvPicPr>
                   <pic:blipFill>
-                    <a:blip r:embed="rId24"/>
+                    <a:blip r:embed="rId26"/>
                     <a:stretch>
                       <a:fillRect/>
                     </a:stretch>

</xml_diff>